<commit_message>
Remove the acknowledgments (the three colleagues declined) and record the confirmed items
Co-Authored-By: Claude Sonnet 5.5 <noreply@anthropic.com>
Claude-Session: https://claude.ai/code/session_013TkounLTBFVQRstE3VnhkM
</commit_message>
<xml_diff>
--- a/EJR_2_TitlePage.docx
+++ b/EJR_2_TitlePage.docx
@@ -167,20 +167,6 @@
         <w:rPr>
           <w:b/>
         </w:rPr>
-        <w:t>Acknowledgments:</w:t>
-      </w:r>
-      <w:r>
-        <w:t xml:space="preserve"> The authors thank Guanghua Zhang, Hongxi Guo and Haibin Wang (Department of General Surgery, Wuhan Children's Hospital) for their contribution to the acquisition of clinical and operative data.</w:t>
-      </w:r>
-    </w:p>
-    <w:p>
-      <w:pPr>
-        <w:spacing w:after="160"/>
-      </w:pPr>
-      <w:r>
-        <w:rPr>
-          <w:b/>
-        </w:rPr>
         <w:t>Funding:</w:t>
       </w:r>
       <w:r>
@@ -272,7 +258,7 @@
         <w:t>Note to the editorial office:</w:t>
       </w:r>
       <w:r>
-        <w:t xml:space="preserve"> This journal follows a double anonymized review process. The manuscript and the supplementary files contain no author names, affiliations, acknowledgments, institution name or ethics approval number; these appear only on this title page. The declaration of competing interests generated with the Elsevier declarations tool, the CRediT author statement, the declarations file and the highlights are uploaded as separate files.</w:t>
+        <w:t xml:space="preserve"> This journal follows a double anonymized review process. The manuscript and the supplementary files contain no author names, affiliations, institution name or ethics approval number; these appear only on this title page. The declaration of competing interests generated with the Elsevier declarations tool, the CRediT author statement, the declarations file and the highlights are uploaded as separate files.</w:t>
       </w:r>
     </w:p>
     <w:sectPr>

</xml_diff>